<commit_message>
Manual / cmdref renders: code at 7.5pt (Dave 2026-10-19) -- the Word reference's VerbatimChar run style (pandoc puts it on every code run, so it governs the blocks too) and the SourceCode paragraph style both 7.5pt, block indent 240 so a 100-column transcript line fits the text width; tools/manual.css for the HTML builds (pre 0.78em); the two published PDFs refreshed (manual 230 pages)
Co-Authored-By: Claude Fable 5.1 <noreply@anthropic.com>
</commit_message>
<xml_diff>
--- a/docs/macos-manual/reference.docx
+++ b/docs/macos-manual/reference.docx
@@ -1004,7 +1004,7 @@
     <w:basedOn w:val="BodyTextChar"/>
     <w:rPr>
       <w:rFonts w:ascii="Courier New" w:hAnsi="Courier New" w:eastAsia="Courier New" w:cs="Courier New"/>
-      <w:sz w:val="22"/>
+      <w:sz w:val="15"/>
     </w:rPr>
   </w:style>
   <w:style w:type="character" w:customStyle="1" w:styleId="SectionNumber">
@@ -1049,13 +1049,13 @@
     <w:pPr>
       <w:wordWrap w:val="0"/>
       <w:spacing w:before="60" w:after="60" w:line="240" w:lineRule="auto"/>
-      <w:ind w:left="480"/>
+      <w:ind w:left="240"/>
       <w:shd w:val="clear" w:color="auto" w:fill="F5F5F5"/>
     </w:pPr>
     <w:rPr>
       <w:rFonts w:ascii="Courier New" w:hAnsi="Courier New" w:cs="Courier New"/>
-      <w:sz w:val="18"/>
-      <w:szCs w:val="18"/>
+      <w:sz w:val="15"/>
+      <w:szCs w:val="15"/>
     </w:rPr>
   </w:style>
 </w:styles>

</xml_diff>